<commit_message>
fix(paper): remediate remaining Word v3 compatibility
</commit_message>
<xml_diff>
--- a/docs/paper/manuscript/template/hfut_journal_reference_v1.0.docx
+++ b/docs/paper/manuscript/template/hfut_journal_reference_v1.0.docx
@@ -53,14 +53,12 @@
         <w:ind w:left="0" w:hanging="0"/>
       </w:pPr>
       <w:rPr>
-        <w:rPr>
-          <w:rFonts w:ascii="Times New Roman" w:hAnsi="Times New Roman" w:eastAsia="黑体" w:cs="Times New Roman"/>
-          <w:b/>
-          <w:bCs/>
-          <w:sz w:val="28"/>
-          <w:szCs w:val="28"/>
-          <w:lang w:val="en-US" w:eastAsia="zh-CN" w:bidi="ar-SA"/>
-        </w:rPr>
+        <w:rFonts w:ascii="Times New Roman" w:hAnsi="Times New Roman" w:eastAsia="黑体" w:cs="Times New Roman"/>
+        <w:b/>
+        <w:bCs/>
+        <w:sz w:val="28"/>
+        <w:szCs w:val="28"/>
+        <w:lang w:val="en-US" w:eastAsia="zh-CN" w:bidi="ar-SA"/>
       </w:rPr>
     </w:lvl>
     <w:lvl w:ilvl="1">
@@ -72,14 +70,12 @@
         <w:ind w:left="0" w:hanging="0"/>
       </w:pPr>
       <w:rPr>
-        <w:rPr>
-          <w:rFonts w:ascii="Times New Roman" w:hAnsi="Times New Roman" w:eastAsia="黑体" w:cs="Times New Roman"/>
-          <w:b/>
-          <w:bCs/>
-          <w:sz w:val="21"/>
-          <w:szCs w:val="21"/>
-          <w:lang w:val="en-US" w:eastAsia="zh-CN" w:bidi="ar-SA"/>
-        </w:rPr>
+        <w:rFonts w:ascii="Times New Roman" w:hAnsi="Times New Roman" w:eastAsia="黑体" w:cs="Times New Roman"/>
+        <w:b/>
+        <w:bCs/>
+        <w:sz w:val="21"/>
+        <w:szCs w:val="21"/>
+        <w:lang w:val="en-US" w:eastAsia="zh-CN" w:bidi="ar-SA"/>
       </w:rPr>
     </w:lvl>
     <w:lvl w:ilvl="2">
@@ -91,12 +87,10 @@
         <w:ind w:left="0" w:hanging="0"/>
       </w:pPr>
       <w:rPr>
-        <w:rPr>
-          <w:rFonts w:ascii="Times New Roman" w:hAnsi="Times New Roman" w:eastAsia="楷体" w:cs="Times New Roman"/>
-          <w:sz w:val="21"/>
-          <w:szCs w:val="21"/>
-          <w:lang w:val="en-US" w:eastAsia="zh-CN" w:bidi="ar-SA"/>
-        </w:rPr>
+        <w:rFonts w:ascii="Times New Roman" w:hAnsi="Times New Roman" w:eastAsia="楷体" w:cs="Times New Roman"/>
+        <w:sz w:val="21"/>
+        <w:szCs w:val="21"/>
+        <w:lang w:val="en-US" w:eastAsia="zh-CN" w:bidi="ar-SA"/>
       </w:rPr>
     </w:lvl>
   </w:abstractNum>
@@ -111,14 +105,12 @@
         <w:ind w:left="0" w:hanging="0"/>
       </w:pPr>
       <w:rPr>
-        <w:rPr>
-          <w:rFonts w:ascii="Times New Roman" w:hAnsi="Times New Roman" w:eastAsia="黑体" w:cs="Times New Roman"/>
-          <w:b/>
-          <w:bCs/>
-          <w:sz w:val="28"/>
-          <w:szCs w:val="28"/>
-          <w:lang w:val="en-US" w:eastAsia="zh-CN" w:bidi="ar-SA"/>
-        </w:rPr>
+        <w:rFonts w:ascii="Times New Roman" w:hAnsi="Times New Roman" w:eastAsia="黑体" w:cs="Times New Roman"/>
+        <w:b/>
+        <w:bCs/>
+        <w:sz w:val="28"/>
+        <w:szCs w:val="28"/>
+        <w:lang w:val="en-US" w:eastAsia="zh-CN" w:bidi="ar-SA"/>
       </w:rPr>
     </w:lvl>
   </w:abstractNum>
@@ -907,7 +899,6 @@
     <w:basedOn w:val="TableNormal"/>
     <w:qFormat/>
     <w:tblPr>
-      <w:tblLayout w:type="fixed"/>
       <w:tblBorders>
         <w:top w:val="single" w:sz="8" w:space="0" w:color="000000"/>
         <w:left w:val="nil"/>
@@ -916,6 +907,7 @@
         <w:insideH w:val="single" w:sz="4" w:space="0" w:color="000000"/>
         <w:insideV w:val="nil"/>
       </w:tblBorders>
+      <w:tblLayout w:type="fixed"/>
       <w:tblCellMar>
         <w:top w:w="0" w:type="dxa"/>
         <w:left w:w="108" w:type="dxa"/>

</xml_diff>

<commit_message>
fix(paper): validate and repair canonical OOXML schema
</commit_message>
<xml_diff>
--- a/docs/paper/manuscript/template/hfut_journal_reference_v1.0.docx
+++ b/docs/paper/manuscript/template/hfut_journal_reference_v1.0.docx
@@ -142,9 +142,9 @@
     <w:name w:val="Normal"/>
     <w:qFormat/>
     <w:pPr>
+      <w:spacing w:before="0" w:after="0" w:line="320" w:lineRule="exact"/>
+      <w:ind w:firstLine="200"/>
       <w:jc w:val="both"/>
-      <w:ind w:firstLine="200"/>
-      <w:spacing w:before="0" w:after="0" w:line="320" w:lineRule="exact"/>
     </w:pPr>
     <w:rPr>
       <w:rFonts w:ascii="Times New Roman" w:hAnsi="Times New Roman" w:eastAsia="宋体" w:cs="Times New Roman"/>
@@ -157,9 +157,9 @@
     <w:name w:val="Page Number"/>
     <w:basedOn w:val="Normal"/>
     <w:pPr>
-      <w:jc w:val="center"/>
+      <w:spacing w:before="0" w:after="0" w:line="240" w:lineRule="exact"/>
       <w:ind w:firstLine="0"/>
-      <w:spacing w:before="0" w:after="0" w:line="240" w:lineRule="exact"/>
+      <w:jc w:val="center"/>
     </w:pPr>
     <w:rPr>
       <w:rFonts w:ascii="Times New Roman" w:hAnsi="Times New Roman" w:eastAsia="Times New Roman" w:cs="Times New Roman"/>
@@ -173,9 +173,9 @@
     <w:basedOn w:val="Normal"/>
     <w:qFormat/>
     <w:pPr>
-      <w:jc w:val="center"/>
+      <w:keepNext/>
       <w:spacing w:before="0" w:after="0" w:line="240" w:lineRule="exact"/>
-      <w:keepNext/>
+      <w:jc w:val="center"/>
     </w:pPr>
     <w:rPr>
       <w:rFonts w:ascii="Times New Roman" w:hAnsi="Times New Roman" w:eastAsia="Times New Roman" w:cs="Times New Roman"/>
@@ -191,9 +191,9 @@
     <w:basedOn w:val="Normal"/>
     <w:qFormat/>
     <w:pPr>
+      <w:spacing w:before="0" w:after="0" w:line="320" w:lineRule="exact"/>
+      <w:ind w:firstLine="200"/>
       <w:jc w:val="both"/>
-      <w:ind w:firstLine="200"/>
-      <w:spacing w:before="0" w:after="0" w:line="320" w:lineRule="exact"/>
     </w:pPr>
     <w:rPr>
       <w:rFonts w:ascii="Times New Roman" w:hAnsi="Times New Roman" w:eastAsia="宋体" w:cs="Times New Roman"/>
@@ -207,9 +207,9 @@
     <w:basedOn w:val="Normal"/>
     <w:qFormat/>
     <w:pPr>
-      <w:jc w:val="center"/>
+      <w:keepNext/>
       <w:spacing w:before="0" w:after="0" w:line="360" w:lineRule="exact"/>
-      <w:keepNext/>
+      <w:jc w:val="center"/>
     </w:pPr>
     <w:rPr>
       <w:rFonts w:ascii="Times New Roman" w:hAnsi="Times New Roman" w:eastAsia="黑体" w:cs="Times New Roman"/>
@@ -225,9 +225,9 @@
     <w:basedOn w:val="Normal"/>
     <w:qFormat/>
     <w:pPr>
-      <w:jc w:val="center"/>
+      <w:keepNext/>
       <w:spacing w:before="0" w:after="0" w:line="336" w:lineRule="exact"/>
-      <w:keepNext/>
+      <w:jc w:val="center"/>
     </w:pPr>
     <w:rPr>
       <w:rFonts w:ascii="Times New Roman" w:hAnsi="Times New Roman" w:eastAsia="Times New Roman" w:cs="Times New Roman"/>
@@ -241,8 +241,8 @@
     <w:basedOn w:val="Normal"/>
     <w:qFormat/>
     <w:pPr>
-      <w:jc w:val="center"/>
       <w:spacing w:before="0" w:after="0" w:line="300" w:lineRule="exact"/>
+      <w:jc w:val="center"/>
     </w:pPr>
     <w:rPr>
       <w:rFonts w:ascii="Times New Roman" w:hAnsi="Times New Roman" w:eastAsia="宋体" w:cs="Times New Roman"/>
@@ -256,8 +256,8 @@
     <w:basedOn w:val="Normal"/>
     <w:qFormat/>
     <w:pPr>
-      <w:jc w:val="center"/>
       <w:spacing w:before="0" w:after="0" w:line="300" w:lineRule="exact"/>
+      <w:jc w:val="center"/>
     </w:pPr>
     <w:rPr>
       <w:rFonts w:ascii="Times New Roman" w:hAnsi="Times New Roman" w:eastAsia="Times New Roman" w:cs="Times New Roman"/>
@@ -271,8 +271,8 @@
     <w:basedOn w:val="Normal"/>
     <w:qFormat/>
     <w:pPr>
-      <w:jc w:val="center"/>
       <w:spacing w:before="0" w:after="0" w:line="240" w:lineRule="exact"/>
+      <w:jc w:val="center"/>
     </w:pPr>
     <w:rPr>
       <w:rFonts w:ascii="Times New Roman" w:hAnsi="Times New Roman" w:eastAsia="宋体" w:cs="Times New Roman"/>
@@ -286,8 +286,8 @@
     <w:basedOn w:val="Normal"/>
     <w:qFormat/>
     <w:pPr>
-      <w:jc w:val="center"/>
       <w:spacing w:before="0" w:after="0" w:line="240" w:lineRule="exact"/>
+      <w:jc w:val="center"/>
     </w:pPr>
     <w:rPr>
       <w:rFonts w:ascii="Times New Roman" w:hAnsi="Times New Roman" w:eastAsia="Times New Roman" w:cs="Times New Roman"/>
@@ -301,8 +301,8 @@
     <w:basedOn w:val="Normal"/>
     <w:qFormat/>
     <w:pPr>
+      <w:spacing w:before="0" w:after="0" w:line="280" w:lineRule="exact"/>
       <w:jc w:val="both"/>
-      <w:spacing w:before="0" w:after="0" w:line="280" w:lineRule="exact"/>
     </w:pPr>
     <w:rPr>
       <w:rFonts w:ascii="Times New Roman" w:hAnsi="Times New Roman" w:eastAsia="黑体" w:cs="Times New Roman"/>
@@ -318,8 +318,8 @@
     <w:basedOn w:val="Normal"/>
     <w:qFormat/>
     <w:pPr>
+      <w:spacing w:before="0" w:after="0" w:line="280" w:lineRule="exact"/>
       <w:jc w:val="both"/>
-      <w:spacing w:before="0" w:after="0" w:line="280" w:lineRule="exact"/>
     </w:pPr>
     <w:rPr>
       <w:rFonts w:ascii="Times New Roman" w:hAnsi="Times New Roman" w:eastAsia="宋体" w:cs="Times New Roman"/>
@@ -333,8 +333,8 @@
     <w:basedOn w:val="Normal"/>
     <w:qFormat/>
     <w:pPr>
+      <w:spacing w:before="0" w:after="0" w:line="280" w:lineRule="exact"/>
       <w:jc w:val="both"/>
-      <w:spacing w:before="0" w:after="0" w:line="280" w:lineRule="exact"/>
     </w:pPr>
     <w:rPr>
       <w:rFonts w:ascii="Times New Roman" w:hAnsi="Times New Roman" w:eastAsia="Times New Roman" w:cs="Times New Roman"/>
@@ -350,8 +350,8 @@
     <w:basedOn w:val="Normal"/>
     <w:qFormat/>
     <w:pPr>
+      <w:spacing w:before="0" w:after="0" w:line="280" w:lineRule="exact"/>
       <w:jc w:val="both"/>
-      <w:spacing w:before="0" w:after="0" w:line="280" w:lineRule="exact"/>
     </w:pPr>
     <w:rPr>
       <w:rFonts w:ascii="Times New Roman" w:hAnsi="Times New Roman" w:eastAsia="Times New Roman" w:cs="Times New Roman"/>
@@ -365,8 +365,8 @@
     <w:basedOn w:val="Normal"/>
     <w:qFormat/>
     <w:pPr>
+      <w:spacing w:before="0" w:after="0" w:line="280" w:lineRule="exact"/>
       <w:jc w:val="both"/>
-      <w:spacing w:before="0" w:after="0" w:line="280" w:lineRule="exact"/>
     </w:pPr>
     <w:rPr>
       <w:rFonts w:ascii="Times New Roman" w:hAnsi="Times New Roman" w:eastAsia="黑体" w:cs="Times New Roman"/>
@@ -382,8 +382,8 @@
     <w:basedOn w:val="Normal"/>
     <w:qFormat/>
     <w:pPr>
+      <w:spacing w:before="0" w:after="0" w:line="280" w:lineRule="exact"/>
       <w:jc w:val="both"/>
-      <w:spacing w:before="0" w:after="0" w:line="280" w:lineRule="exact"/>
     </w:pPr>
     <w:rPr>
       <w:rFonts w:ascii="Times New Roman" w:hAnsi="Times New Roman" w:eastAsia="宋体" w:cs="Times New Roman"/>
@@ -397,8 +397,8 @@
     <w:basedOn w:val="Normal"/>
     <w:qFormat/>
     <w:pPr>
+      <w:spacing w:before="0" w:after="0" w:line="280" w:lineRule="exact"/>
       <w:jc w:val="both"/>
-      <w:spacing w:before="0" w:after="0" w:line="280" w:lineRule="exact"/>
     </w:pPr>
     <w:rPr>
       <w:rFonts w:ascii="Times New Roman" w:hAnsi="Times New Roman" w:eastAsia="Times New Roman" w:cs="Times New Roman"/>
@@ -414,8 +414,8 @@
     <w:basedOn w:val="Normal"/>
     <w:qFormat/>
     <w:pPr>
+      <w:spacing w:before="0" w:after="0" w:line="280" w:lineRule="exact"/>
       <w:jc w:val="both"/>
-      <w:spacing w:before="0" w:after="0" w:line="280" w:lineRule="exact"/>
     </w:pPr>
     <w:rPr>
       <w:rFonts w:ascii="Times New Roman" w:hAnsi="Times New Roman" w:eastAsia="Times New Roman" w:cs="Times New Roman"/>
@@ -429,8 +429,8 @@
     <w:basedOn w:val="Normal"/>
     <w:qFormat/>
     <w:pPr>
-      <w:jc w:val="left"/>
-      <w:spacing w:before="0" w:after="0" w:line="280" w:lineRule="exact"/>
+      <w:spacing w:before="0" w:after="0" w:line="280" w:lineRule="exact"/>
+      <w:jc w:val="left"/>
     </w:pPr>
     <w:rPr>
       <w:rFonts w:ascii="Times New Roman" w:hAnsi="Times New Roman" w:eastAsia="宋体" w:cs="Times New Roman"/>
@@ -444,15 +444,15 @@
     <w:basedOn w:val="Normal"/>
     <w:qFormat/>
     <w:pPr>
-      <w:jc w:val="left"/>
-      <w:spacing w:before="0" w:after="0" w:line="320" w:lineRule="exact"/>
       <w:keepNext/>
       <w:keepLines/>
-      <w:outlineLvl w:val="0"/>
       <w:numPr>
         <w:ilvl w:val="0"/>
         <w:numId w:val="1"/>
       </w:numPr>
+      <w:spacing w:before="0" w:after="0" w:line="320" w:lineRule="exact"/>
+      <w:jc w:val="left"/>
+      <w:outlineLvl w:val="0"/>
     </w:pPr>
     <w:rPr>
       <w:rFonts w:ascii="Times New Roman" w:hAnsi="Times New Roman" w:eastAsia="黑体" w:cs="Times New Roman"/>
@@ -468,15 +468,15 @@
     <w:basedOn w:val="Normal"/>
     <w:qFormat/>
     <w:pPr>
-      <w:jc w:val="left"/>
-      <w:spacing w:before="0" w:after="0" w:line="320" w:lineRule="exact"/>
       <w:keepNext/>
       <w:keepLines/>
-      <w:outlineLvl w:val="1"/>
       <w:numPr>
         <w:ilvl w:val="1"/>
         <w:numId w:val="1"/>
       </w:numPr>
+      <w:spacing w:before="0" w:after="0" w:line="320" w:lineRule="exact"/>
+      <w:jc w:val="left"/>
+      <w:outlineLvl w:val="1"/>
     </w:pPr>
     <w:rPr>
       <w:rFonts w:ascii="Times New Roman" w:hAnsi="Times New Roman" w:eastAsia="黑体" w:cs="Times New Roman"/>
@@ -492,15 +492,15 @@
     <w:basedOn w:val="Normal"/>
     <w:qFormat/>
     <w:pPr>
-      <w:jc w:val="left"/>
-      <w:spacing w:before="0" w:after="0" w:line="320" w:lineRule="exact"/>
       <w:keepNext/>
       <w:keepLines/>
-      <w:outlineLvl w:val="2"/>
       <w:numPr>
         <w:ilvl w:val="2"/>
         <w:numId w:val="1"/>
       </w:numPr>
+      <w:spacing w:before="0" w:after="0" w:line="320" w:lineRule="exact"/>
+      <w:jc w:val="left"/>
+      <w:outlineLvl w:val="2"/>
     </w:pPr>
     <w:rPr>
       <w:rFonts w:ascii="Times New Roman" w:hAnsi="Times New Roman" w:eastAsia="楷体" w:cs="Times New Roman"/>
@@ -514,15 +514,15 @@
     <w:basedOn w:val="HFUTHeading1"/>
     <w:qFormat/>
     <w:pPr>
-      <w:jc w:val="left"/>
-      <w:spacing w:before="0" w:after="0" w:line="320" w:lineRule="exact"/>
       <w:keepNext/>
       <w:keepLines/>
-      <w:outlineLvl w:val="0"/>
       <w:numPr>
         <w:ilvl w:val="0"/>
         <w:numId w:val="2"/>
       </w:numPr>
+      <w:spacing w:before="0" w:after="0" w:line="320" w:lineRule="exact"/>
+      <w:jc w:val="left"/>
+      <w:outlineLvl w:val="0"/>
     </w:pPr>
     <w:rPr>
       <w:rFonts w:ascii="Times New Roman" w:hAnsi="Times New Roman" w:eastAsia="黑体" w:cs="Times New Roman"/>
@@ -538,9 +538,9 @@
     <w:basedOn w:val="Normal"/>
     <w:qFormat/>
     <w:pPr>
-      <w:jc w:val="center"/>
-      <w:spacing w:before="0" w:after="0" w:line="320" w:lineRule="exact"/>
-      <w:keepLines/>
+      <w:keepLines/>
+      <w:spacing w:before="0" w:after="0" w:line="320" w:lineRule="exact"/>
+      <w:jc w:val="center"/>
     </w:pPr>
     <w:rPr>
       <w:rFonts w:ascii="Times New Roman" w:hAnsi="Times New Roman" w:eastAsia="Times New Roman" w:cs="Times New Roman"/>
@@ -554,9 +554,9 @@
     <w:basedOn w:val="Normal"/>
     <w:qFormat/>
     <w:pPr>
-      <w:jc w:val="center"/>
-      <w:spacing w:before="0" w:after="0" w:line="320" w:lineRule="exact"/>
-      <w:keepLines/>
+      <w:keepLines/>
+      <w:spacing w:before="0" w:after="0" w:line="320" w:lineRule="exact"/>
+      <w:jc w:val="center"/>
     </w:pPr>
     <w:rPr>
       <w:rFonts w:ascii="Times New Roman" w:hAnsi="Times New Roman" w:eastAsia="黑体" w:cs="Times New Roman"/>
@@ -572,9 +572,9 @@
     <w:basedOn w:val="Normal"/>
     <w:qFormat/>
     <w:pPr>
-      <w:jc w:val="center"/>
-      <w:spacing w:before="0" w:after="0" w:line="320" w:lineRule="exact"/>
-      <w:keepLines/>
+      <w:keepLines/>
+      <w:spacing w:before="0" w:after="0" w:line="320" w:lineRule="exact"/>
+      <w:jc w:val="center"/>
     </w:pPr>
     <w:rPr>
       <w:rFonts w:ascii="Times New Roman" w:hAnsi="Times New Roman" w:eastAsia="黑体" w:cs="Times New Roman"/>
@@ -590,9 +590,9 @@
     <w:basedOn w:val="Normal"/>
     <w:qFormat/>
     <w:pPr>
-      <w:jc w:val="center"/>
+      <w:keepLines/>
       <w:spacing w:before="0" w:after="0" w:line="240" w:lineRule="exact"/>
-      <w:keepLines/>
+      <w:jc w:val="center"/>
     </w:pPr>
     <w:rPr>
       <w:rFonts w:ascii="Times New Roman" w:hAnsi="Times New Roman" w:eastAsia="宋体" w:cs="Times New Roman"/>
@@ -606,10 +606,10 @@
     <w:basedOn w:val="Normal"/>
     <w:qFormat/>
     <w:pPr>
-      <w:jc w:val="left"/>
-      <w:spacing w:before="0" w:after="0" w:line="320" w:lineRule="exact"/>
       <w:keepNext/>
       <w:keepLines/>
+      <w:spacing w:before="0" w:after="0" w:line="320" w:lineRule="exact"/>
+      <w:jc w:val="left"/>
     </w:pPr>
     <w:rPr>
       <w:rFonts w:ascii="Times New Roman" w:hAnsi="Times New Roman" w:eastAsia="黑体" w:cs="Times New Roman"/>
@@ -625,10 +625,10 @@
     <w:basedOn w:val="Normal"/>
     <w:qFormat/>
     <w:pPr>
-      <w:jc w:val="left"/>
-      <w:ind w:firstLine="-360" w:left="360"/>
-      <w:spacing w:before="0" w:after="0" w:line="280" w:lineRule="exact"/>
-      <w:keepLines/>
+      <w:keepLines/>
+      <w:spacing w:before="0" w:after="0" w:line="280" w:lineRule="exact"/>
+      <w:ind w:hanging="360" w:left="360"/>
+      <w:jc w:val="left"/>
     </w:pPr>
     <w:rPr>
       <w:rFonts w:ascii="Times New Roman" w:hAnsi="Times New Roman" w:eastAsia="宋体" w:cs="Times New Roman"/>
@@ -642,8 +642,8 @@
     <w:basedOn w:val="Normal"/>
     <w:qFormat/>
     <w:pPr>
-      <w:jc w:val="left"/>
-      <w:spacing w:before="0" w:after="0" w:line="280" w:lineRule="exact"/>
+      <w:spacing w:before="0" w:after="0" w:line="280" w:lineRule="exact"/>
+      <w:jc w:val="left"/>
     </w:pPr>
     <w:rPr>
       <w:rFonts w:ascii="Times New Roman" w:hAnsi="Times New Roman" w:eastAsia="宋体" w:cs="Times New Roman"/>
@@ -657,8 +657,8 @@
     <w:basedOn w:val="Normal"/>
     <w:qFormat/>
     <w:pPr>
-      <w:jc w:val="left"/>
-      <w:spacing w:before="0" w:after="0" w:line="280" w:lineRule="exact"/>
+      <w:spacing w:before="0" w:after="0" w:line="280" w:lineRule="exact"/>
+      <w:jc w:val="left"/>
     </w:pPr>
     <w:rPr>
       <w:rFonts w:ascii="Times New Roman" w:hAnsi="Times New Roman" w:eastAsia="宋体" w:cs="Times New Roman"/>
@@ -672,8 +672,8 @@
     <w:basedOn w:val="Normal"/>
     <w:qFormat/>
     <w:pPr>
-      <w:jc w:val="left"/>
-      <w:spacing w:before="0" w:after="0" w:line="280" w:lineRule="exact"/>
+      <w:spacing w:before="0" w:after="0" w:line="280" w:lineRule="exact"/>
+      <w:jc w:val="left"/>
     </w:pPr>
     <w:rPr>
       <w:rFonts w:ascii="Times New Roman" w:hAnsi="Times New Roman" w:eastAsia="宋体" w:cs="Times New Roman"/>
@@ -687,9 +687,9 @@
     <w:basedOn w:val="HFUTBody"/>
     <w:qFormat/>
     <w:pPr>
+      <w:spacing w:before="0" w:after="0" w:line="320" w:lineRule="exact"/>
+      <w:ind w:firstLine="200"/>
       <w:jc w:val="both"/>
-      <w:ind w:firstLine="200"/>
-      <w:spacing w:before="0" w:after="0" w:line="320" w:lineRule="exact"/>
     </w:pPr>
     <w:rPr>
       <w:rFonts w:ascii="Times New Roman" w:hAnsi="Times New Roman" w:eastAsia="宋体" w:cs="Times New Roman"/>
@@ -703,9 +703,9 @@
     <w:basedOn w:val="HFUTTitleCN"/>
     <w:qFormat/>
     <w:pPr>
-      <w:jc w:val="center"/>
+      <w:keepNext/>
       <w:spacing w:before="0" w:after="0" w:line="360" w:lineRule="exact"/>
-      <w:keepNext/>
+      <w:jc w:val="center"/>
     </w:pPr>
     <w:rPr>
       <w:rFonts w:ascii="Times New Roman" w:hAnsi="Times New Roman" w:eastAsia="黑体" w:cs="Times New Roman"/>
@@ -721,9 +721,9 @@
     <w:basedOn w:val="HFUTTitleEN"/>
     <w:qFormat/>
     <w:pPr>
-      <w:jc w:val="center"/>
+      <w:keepNext/>
       <w:spacing w:before="0" w:after="0" w:line="336" w:lineRule="exact"/>
-      <w:keepNext/>
+      <w:jc w:val="center"/>
     </w:pPr>
     <w:rPr>
       <w:rFonts w:ascii="Times New Roman" w:hAnsi="Times New Roman" w:eastAsia="Times New Roman" w:cs="Times New Roman"/>
@@ -737,8 +737,8 @@
     <w:basedOn w:val="HFUTAuthorsEN"/>
     <w:qFormat/>
     <w:pPr>
-      <w:jc w:val="center"/>
       <w:spacing w:before="0" w:after="0" w:line="300" w:lineRule="exact"/>
+      <w:jc w:val="center"/>
     </w:pPr>
     <w:rPr>
       <w:rFonts w:ascii="Times New Roman" w:hAnsi="Times New Roman" w:eastAsia="Times New Roman" w:cs="Times New Roman"/>
@@ -752,8 +752,8 @@
     <w:basedOn w:val="HFUTAbstractBodyEN"/>
     <w:qFormat/>
     <w:pPr>
+      <w:spacing w:before="0" w:after="0" w:line="280" w:lineRule="exact"/>
       <w:jc w:val="both"/>
-      <w:spacing w:before="0" w:after="0" w:line="280" w:lineRule="exact"/>
     </w:pPr>
     <w:rPr>
       <w:rFonts w:ascii="Times New Roman" w:hAnsi="Times New Roman" w:eastAsia="Times New Roman" w:cs="Times New Roman"/>
@@ -767,15 +767,15 @@
     <w:basedOn w:val="HFUTHeading1"/>
     <w:qFormat/>
     <w:pPr>
-      <w:jc w:val="left"/>
-      <w:spacing w:before="0" w:after="0" w:line="320" w:lineRule="exact"/>
       <w:keepNext/>
       <w:keepLines/>
-      <w:outlineLvl w:val="0"/>
       <w:numPr>
         <w:ilvl w:val="0"/>
         <w:numId w:val="1"/>
       </w:numPr>
+      <w:spacing w:before="0" w:after="0" w:line="320" w:lineRule="exact"/>
+      <w:jc w:val="left"/>
+      <w:outlineLvl w:val="0"/>
     </w:pPr>
     <w:rPr>
       <w:rFonts w:ascii="Times New Roman" w:hAnsi="Times New Roman" w:eastAsia="黑体" w:cs="Times New Roman"/>
@@ -791,15 +791,15 @@
     <w:basedOn w:val="HFUTHeading2"/>
     <w:qFormat/>
     <w:pPr>
-      <w:jc w:val="left"/>
-      <w:spacing w:before="0" w:after="0" w:line="320" w:lineRule="exact"/>
       <w:keepNext/>
       <w:keepLines/>
-      <w:outlineLvl w:val="1"/>
       <w:numPr>
         <w:ilvl w:val="1"/>
         <w:numId w:val="1"/>
       </w:numPr>
+      <w:spacing w:before="0" w:after="0" w:line="320" w:lineRule="exact"/>
+      <w:jc w:val="left"/>
+      <w:outlineLvl w:val="1"/>
     </w:pPr>
     <w:rPr>
       <w:rFonts w:ascii="Times New Roman" w:hAnsi="Times New Roman" w:eastAsia="黑体" w:cs="Times New Roman"/>
@@ -815,15 +815,15 @@
     <w:basedOn w:val="HFUTHeading3"/>
     <w:qFormat/>
     <w:pPr>
-      <w:jc w:val="left"/>
-      <w:spacing w:before="0" w:after="0" w:line="320" w:lineRule="exact"/>
       <w:keepNext/>
       <w:keepLines/>
-      <w:outlineLvl w:val="2"/>
       <w:numPr>
         <w:ilvl w:val="2"/>
         <w:numId w:val="1"/>
       </w:numPr>
+      <w:spacing w:before="0" w:after="0" w:line="320" w:lineRule="exact"/>
+      <w:jc w:val="left"/>
+      <w:outlineLvl w:val="2"/>
     </w:pPr>
     <w:rPr>
       <w:rFonts w:ascii="Times New Roman" w:hAnsi="Times New Roman" w:eastAsia="楷体" w:cs="Times New Roman"/>
@@ -837,9 +837,9 @@
     <w:basedOn w:val="HFUTFigureCaption"/>
     <w:qFormat/>
     <w:pPr>
-      <w:jc w:val="center"/>
-      <w:spacing w:before="0" w:after="0" w:line="320" w:lineRule="exact"/>
-      <w:keepLines/>
+      <w:keepLines/>
+      <w:spacing w:before="0" w:after="0" w:line="320" w:lineRule="exact"/>
+      <w:jc w:val="center"/>
     </w:pPr>
     <w:rPr>
       <w:rFonts w:ascii="Times New Roman" w:hAnsi="Times New Roman" w:eastAsia="黑体" w:cs="Times New Roman"/>
@@ -855,9 +855,9 @@
     <w:basedOn w:val="HFUTTableContent"/>
     <w:qFormat/>
     <w:pPr>
-      <w:jc w:val="center"/>
+      <w:keepLines/>
       <w:spacing w:before="0" w:after="0" w:line="240" w:lineRule="exact"/>
-      <w:keepLines/>
+      <w:jc w:val="center"/>
     </w:pPr>
     <w:rPr>
       <w:rFonts w:ascii="Times New Roman" w:hAnsi="Times New Roman" w:eastAsia="宋体" w:cs="Times New Roman"/>
@@ -871,10 +871,10 @@
     <w:basedOn w:val="HFUTReferenceEntry"/>
     <w:qFormat/>
     <w:pPr>
-      <w:jc w:val="left"/>
-      <w:ind w:firstLine="-360" w:left="360"/>
-      <w:spacing w:before="0" w:after="0" w:line="280" w:lineRule="exact"/>
-      <w:keepLines/>
+      <w:keepLines/>
+      <w:spacing w:before="0" w:after="0" w:line="280" w:lineRule="exact"/>
+      <w:ind w:hanging="360" w:left="360"/>
+      <w:jc w:val="left"/>
     </w:pPr>
     <w:rPr>
       <w:rFonts w:ascii="Times New Roman" w:hAnsi="Times New Roman" w:eastAsia="宋体" w:cs="Times New Roman"/>
@@ -907,7 +907,6 @@
         <w:insideH w:val="single" w:sz="4" w:space="0" w:color="000000"/>
         <w:insideV w:val="nil"/>
       </w:tblBorders>
-      <w:tblLayout w:type="fixed"/>
       <w:tblCellMar>
         <w:top w:w="0" w:type="dxa"/>
         <w:left w:w="108" w:type="dxa"/>
@@ -937,54 +936,286 @@
         <a:sysClr val="window" lastClr="FFFFFF"/>
       </a:lt1>
       <a:dk2>
-        <a:srgbClr val="1F497D"/>
+        <a:srgbClr val="0E2841"/>
       </a:dk2>
       <a:lt2>
-        <a:srgbClr val="EEECE1"/>
+        <a:srgbClr val="E8E8E8"/>
       </a:lt2>
       <a:accent1>
-        <a:srgbClr val="4F81BD"/>
+        <a:srgbClr val="156082"/>
       </a:accent1>
       <a:accent2>
-        <a:srgbClr val="C0504D"/>
+        <a:srgbClr val="E97132"/>
       </a:accent2>
       <a:accent3>
-        <a:srgbClr val="9BBB59"/>
+        <a:srgbClr val="196B24"/>
       </a:accent3>
       <a:accent4>
-        <a:srgbClr val="8064A2"/>
+        <a:srgbClr val="0F9ED5"/>
       </a:accent4>
       <a:accent5>
-        <a:srgbClr val="4BACC6"/>
+        <a:srgbClr val="A02B93"/>
       </a:accent5>
       <a:accent6>
-        <a:srgbClr val="F79646"/>
+        <a:srgbClr val="4EA72E"/>
       </a:accent6>
       <a:hlink>
-        <a:srgbClr val="0000FF"/>
+        <a:srgbClr val="467886"/>
       </a:hlink>
       <a:folHlink>
-        <a:srgbClr val="800080"/>
+        <a:srgbClr val="96607D"/>
       </a:folHlink>
     </a:clrScheme>
     <a:fontScheme name="Office">
       <a:majorFont>
-        <a:latin typeface="Arial"/>
+        <a:latin typeface="Aptos Display" panose="02110004020202020204"/>
         <a:ea typeface=""/>
         <a:cs typeface=""/>
+        <a:font script="Jpan" typeface="游ゴシック Light"/>
+        <a:font script="Hang" typeface="맑은 고딕"/>
+        <a:font script="Hans" typeface="等线 Light"/>
+        <a:font script="Hant" typeface="新細明體"/>
+        <a:font script="Arab" typeface="Times New Roman"/>
+        <a:font script="Hebr" typeface="Times New Roman"/>
+        <a:font script="Thai" typeface="Angsana New"/>
+        <a:font script="Ethi" typeface="Nyala"/>
+        <a:font script="Beng" typeface="Vrinda"/>
+        <a:font script="Gujr" typeface="Shruti"/>
+        <a:font script="Khmr" typeface="MoolBoran"/>
+        <a:font script="Knda" typeface="Tunga"/>
+        <a:font script="Guru" typeface="Raavi"/>
+        <a:font script="Cans" typeface="Euphemia"/>
+        <a:font script="Cher" typeface="Plantagenet Cherokee"/>
+        <a:font script="Yiii" typeface="Microsoft Yi Baiti"/>
+        <a:font script="Tibt" typeface="Microsoft Himalaya"/>
+        <a:font script="Thaa" typeface="MV Boli"/>
+        <a:font script="Deva" typeface="Mangal"/>
+        <a:font script="Telu" typeface="Gautami"/>
+        <a:font script="Taml" typeface="Latha"/>
+        <a:font script="Syrc" typeface="Estrangelo Edessa"/>
+        <a:font script="Orya" typeface="Kalinga"/>
+        <a:font script="Mlym" typeface="Kartika"/>
+        <a:font script="Laoo" typeface="DokChampa"/>
+        <a:font script="Sinh" typeface="Iskoola Pota"/>
+        <a:font script="Mong" typeface="Mongolian Baiti"/>
+        <a:font script="Viet" typeface="Times New Roman"/>
+        <a:font script="Uigh" typeface="Microsoft Uighur"/>
+        <a:font script="Geor" typeface="Sylfaen"/>
+        <a:font script="Armn" typeface="Arial"/>
+        <a:font script="Bugi" typeface="Leelawadee UI"/>
+        <a:font script="Bopo" typeface="Microsoft JhengHei"/>
+        <a:font script="Java" typeface="Javanese Text"/>
+        <a:font script="Lisu" typeface="Segoe UI"/>
+        <a:font script="Mymr" typeface="Myanmar Text"/>
+        <a:font script="Nkoo" typeface="Ebrima"/>
+        <a:font script="Olck" typeface="Nirmala UI"/>
+        <a:font script="Osma" typeface="Ebrima"/>
+        <a:font script="Phag" typeface="Phagspa"/>
+        <a:font script="Syrn" typeface="Estrangelo Edessa"/>
+        <a:font script="Syrj" typeface="Estrangelo Edessa"/>
+        <a:font script="Syre" typeface="Estrangelo Edessa"/>
+        <a:font script="Sora" typeface="Nirmala UI"/>
+        <a:font script="Tale" typeface="Microsoft Tai Le"/>
+        <a:font script="Talu" typeface="Microsoft New Tai Lue"/>
+        <a:font script="Tfng" typeface="Ebrima"/>
       </a:majorFont>
       <a:minorFont>
-        <a:latin typeface="Arial"/>
+        <a:latin typeface="Aptos" panose="02110004020202020204"/>
         <a:ea typeface=""/>
         <a:cs typeface=""/>
+        <a:font script="Jpan" typeface="游明朝"/>
+        <a:font script="Hang" typeface="맑은 고딕"/>
+        <a:font script="Hans" typeface="等线"/>
+        <a:font script="Hant" typeface="新細明體"/>
+        <a:font script="Arab" typeface="Arial"/>
+        <a:font script="Hebr" typeface="Arial"/>
+        <a:font script="Thai" typeface="Cordia New"/>
+        <a:font script="Ethi" typeface="Nyala"/>
+        <a:font script="Beng" typeface="Vrinda"/>
+        <a:font script="Gujr" typeface="Shruti"/>
+        <a:font script="Khmr" typeface="DaunPenh"/>
+        <a:font script="Knda" typeface="Tunga"/>
+        <a:font script="Guru" typeface="Raavi"/>
+        <a:font script="Cans" typeface="Euphemia"/>
+        <a:font script="Cher" typeface="Plantagenet Cherokee"/>
+        <a:font script="Yiii" typeface="Microsoft Yi Baiti"/>
+        <a:font script="Tibt" typeface="Microsoft Himalaya"/>
+        <a:font script="Thaa" typeface="MV Boli"/>
+        <a:font script="Deva" typeface="Mangal"/>
+        <a:font script="Telu" typeface="Gautami"/>
+        <a:font script="Taml" typeface="Latha"/>
+        <a:font script="Syrc" typeface="Estrangelo Edessa"/>
+        <a:font script="Orya" typeface="Kalinga"/>
+        <a:font script="Mlym" typeface="Kartika"/>
+        <a:font script="Laoo" typeface="DokChampa"/>
+        <a:font script="Sinh" typeface="Iskoola Pota"/>
+        <a:font script="Mong" typeface="Mongolian Baiti"/>
+        <a:font script="Viet" typeface="Arial"/>
+        <a:font script="Uigh" typeface="Microsoft Uighur"/>
+        <a:font script="Geor" typeface="Sylfaen"/>
+        <a:font script="Armn" typeface="Arial"/>
+        <a:font script="Bugi" typeface="Leelawadee UI"/>
+        <a:font script="Bopo" typeface="Microsoft JhengHei"/>
+        <a:font script="Java" typeface="Javanese Text"/>
+        <a:font script="Lisu" typeface="Segoe UI"/>
+        <a:font script="Mymr" typeface="Myanmar Text"/>
+        <a:font script="Nkoo" typeface="Ebrima"/>
+        <a:font script="Olck" typeface="Nirmala UI"/>
+        <a:font script="Osma" typeface="Ebrima"/>
+        <a:font script="Phag" typeface="Phagspa"/>
+        <a:font script="Syrn" typeface="Estrangelo Edessa"/>
+        <a:font script="Syrj" typeface="Estrangelo Edessa"/>
+        <a:font script="Syre" typeface="Estrangelo Edessa"/>
+        <a:font script="Sora" typeface="Nirmala UI"/>
+        <a:font script="Tale" typeface="Microsoft Tai Le"/>
+        <a:font script="Talu" typeface="Microsoft New Tai Lue"/>
+        <a:font script="Tfng" typeface="Ebrima"/>
       </a:minorFont>
     </a:fontScheme>
     <a:fmtScheme name="Office">
-      <a:fillStyleLst/>
-      <a:lnStyleLst/>
-      <a:effectStyleLst/>
-      <a:bgFillStyleLst/>
+      <a:fillStyleLst>
+        <a:solidFill>
+          <a:schemeClr val="phClr"/>
+        </a:solidFill>
+        <a:gradFill rotWithShape="1">
+          <a:gsLst>
+            <a:gs pos="0">
+              <a:schemeClr val="phClr">
+                <a:lumMod val="110000"/>
+                <a:satMod val="105000"/>
+                <a:tint val="67000"/>
+              </a:schemeClr>
+            </a:gs>
+            <a:gs pos="50000">
+              <a:schemeClr val="phClr">
+                <a:lumMod val="105000"/>
+                <a:satMod val="103000"/>
+                <a:tint val="73000"/>
+              </a:schemeClr>
+            </a:gs>
+            <a:gs pos="100000">
+              <a:schemeClr val="phClr">
+                <a:lumMod val="105000"/>
+                <a:satMod val="109000"/>
+                <a:tint val="81000"/>
+              </a:schemeClr>
+            </a:gs>
+          </a:gsLst>
+          <a:lin ang="5400000" scaled="0"/>
+        </a:gradFill>
+        <a:gradFill rotWithShape="1">
+          <a:gsLst>
+            <a:gs pos="0">
+              <a:schemeClr val="phClr">
+                <a:satMod val="103000"/>
+                <a:lumMod val="102000"/>
+                <a:tint val="94000"/>
+              </a:schemeClr>
+            </a:gs>
+            <a:gs pos="50000">
+              <a:schemeClr val="phClr">
+                <a:satMod val="110000"/>
+                <a:lumMod val="100000"/>
+                <a:shade val="100000"/>
+              </a:schemeClr>
+            </a:gs>
+            <a:gs pos="100000">
+              <a:schemeClr val="phClr">
+                <a:lumMod val="99000"/>
+                <a:satMod val="120000"/>
+                <a:shade val="78000"/>
+              </a:schemeClr>
+            </a:gs>
+          </a:gsLst>
+          <a:lin ang="5400000" scaled="0"/>
+        </a:gradFill>
+      </a:fillStyleLst>
+      <a:lnStyleLst>
+        <a:ln w="6350" cap="flat" cmpd="sng" algn="ctr">
+          <a:solidFill>
+            <a:schemeClr val="phClr"/>
+          </a:solidFill>
+          <a:prstDash val="solid"/>
+          <a:miter lim="800000"/>
+        </a:ln>
+        <a:ln w="12700" cap="flat" cmpd="sng" algn="ctr">
+          <a:solidFill>
+            <a:schemeClr val="phClr"/>
+          </a:solidFill>
+          <a:prstDash val="solid"/>
+          <a:miter lim="800000"/>
+        </a:ln>
+        <a:ln w="19050" cap="flat" cmpd="sng" algn="ctr">
+          <a:solidFill>
+            <a:schemeClr val="phClr"/>
+          </a:solidFill>
+          <a:prstDash val="solid"/>
+          <a:miter lim="800000"/>
+        </a:ln>
+      </a:lnStyleLst>
+      <a:effectStyleLst>
+        <a:effectStyle>
+          <a:effectLst/>
+        </a:effectStyle>
+        <a:effectStyle>
+          <a:effectLst/>
+        </a:effectStyle>
+        <a:effectStyle>
+          <a:effectLst>
+            <a:outerShdw blurRad="57150" dist="19050" dir="5400000" algn="ctr" rotWithShape="0">
+              <a:srgbClr val="000000">
+                <a:alpha val="63000"/>
+              </a:srgbClr>
+            </a:outerShdw>
+          </a:effectLst>
+        </a:effectStyle>
+      </a:effectStyleLst>
+      <a:bgFillStyleLst>
+        <a:solidFill>
+          <a:schemeClr val="phClr"/>
+        </a:solidFill>
+        <a:solidFill>
+          <a:schemeClr val="phClr">
+            <a:tint val="95000"/>
+            <a:satMod val="170000"/>
+          </a:schemeClr>
+        </a:solidFill>
+        <a:gradFill rotWithShape="1">
+          <a:gsLst>
+            <a:gs pos="0">
+              <a:schemeClr val="phClr">
+                <a:tint val="93000"/>
+                <a:satMod val="150000"/>
+                <a:shade val="98000"/>
+                <a:lumMod val="102000"/>
+              </a:schemeClr>
+            </a:gs>
+            <a:gs pos="50000">
+              <a:schemeClr val="phClr">
+                <a:tint val="98000"/>
+                <a:satMod val="130000"/>
+                <a:shade val="90000"/>
+                <a:lumMod val="103000"/>
+              </a:schemeClr>
+            </a:gs>
+            <a:gs pos="100000">
+              <a:schemeClr val="phClr">
+                <a:shade val="63000"/>
+                <a:satMod val="120000"/>
+              </a:schemeClr>
+            </a:gs>
+          </a:gsLst>
+          <a:lin ang="5400000" scaled="0"/>
+        </a:gradFill>
+      </a:bgFillStyleLst>
     </a:fmtScheme>
   </a:themeElements>
+  <a:objectDefaults/>
+  <a:extraClrSchemeLst/>
+  <a:extLst>
+    <a:ext uri="{05A4C25C-085E-4340-85A3-A5531E510DB2}">
+      <thm15:themeFamily xmlns:thm15="http://schemas.microsoft.com/office/thememl/2012/main" name="Office Theme" id="{2E142A2C-CD16-42D6-873A-C26D2A0506FA}" vid="{1BDDFF52-6CD6-40A5-AB3C-68EB2F1E4D0A}"/>
+    </a:ext>
+  </a:extLst>
 </a:theme>
 </file>
</xml_diff>

<commit_message>
fix(paper): remove duplicate Word heading numbering
</commit_message>
<xml_diff>
--- a/docs/paper/manuscript/template/hfut_journal_reference_v1.0.docx
+++ b/docs/paper/manuscript/template/hfut_journal_reference_v1.0.docx
@@ -446,10 +446,6 @@
     <w:pPr>
       <w:keepNext/>
       <w:keepLines/>
-      <w:numPr>
-        <w:ilvl w:val="0"/>
-        <w:numId w:val="1"/>
-      </w:numPr>
       <w:spacing w:before="0" w:after="0" w:line="320" w:lineRule="exact"/>
       <w:jc w:val="left"/>
       <w:outlineLvl w:val="0"/>
@@ -470,10 +466,6 @@
     <w:pPr>
       <w:keepNext/>
       <w:keepLines/>
-      <w:numPr>
-        <w:ilvl w:val="1"/>
-        <w:numId w:val="1"/>
-      </w:numPr>
       <w:spacing w:before="0" w:after="0" w:line="320" w:lineRule="exact"/>
       <w:jc w:val="left"/>
       <w:outlineLvl w:val="1"/>
@@ -494,10 +486,6 @@
     <w:pPr>
       <w:keepNext/>
       <w:keepLines/>
-      <w:numPr>
-        <w:ilvl w:val="2"/>
-        <w:numId w:val="1"/>
-      </w:numPr>
       <w:spacing w:before="0" w:after="0" w:line="320" w:lineRule="exact"/>
       <w:jc w:val="left"/>
       <w:outlineLvl w:val="2"/>
@@ -769,10 +757,6 @@
     <w:pPr>
       <w:keepNext/>
       <w:keepLines/>
-      <w:numPr>
-        <w:ilvl w:val="0"/>
-        <w:numId w:val="1"/>
-      </w:numPr>
       <w:spacing w:before="0" w:after="0" w:line="320" w:lineRule="exact"/>
       <w:jc w:val="left"/>
       <w:outlineLvl w:val="0"/>
@@ -793,10 +777,6 @@
     <w:pPr>
       <w:keepNext/>
       <w:keepLines/>
-      <w:numPr>
-        <w:ilvl w:val="1"/>
-        <w:numId w:val="1"/>
-      </w:numPr>
       <w:spacing w:before="0" w:after="0" w:line="320" w:lineRule="exact"/>
       <w:jc w:val="left"/>
       <w:outlineLvl w:val="1"/>
@@ -817,10 +797,6 @@
     <w:pPr>
       <w:keepNext/>
       <w:keepLines/>
-      <w:numPr>
-        <w:ilvl w:val="2"/>
-        <w:numId w:val="1"/>
-      </w:numPr>
       <w:spacing w:before="0" w:after="0" w:line="320" w:lineRule="exact"/>
       <w:jc w:val="left"/>
       <w:outlineLvl w:val="2"/>

</xml_diff>

<commit_message>
paper: align supervisor draft with HFUT journal format
</commit_message>
<xml_diff>
--- a/docs/paper/manuscript/template/hfut_journal_reference_v1.0.docx
+++ b/docs/paper/manuscript/template/hfut_journal_reference_v1.0.docx
@@ -11,7 +11,7 @@
     <w:sectPr xmlns:w="http://schemas.openxmlformats.org/wordprocessingml/2006/main" xmlns:r="http://schemas.openxmlformats.org/officeDocument/2006/relationships">
       <w:footerReference w:type="default" r:id="rId4"/>
       <w:pgSz w:w="11906" w:h="16838" w:orient="portrait"/>
-      <w:pgMar w:top="1361" w:right="1304" w:bottom="1134" w:left="1304" w:header="720" w:footer="720" w:gutter="0"/>
+      <w:pgMar w:top="1361" w:right="1304" w:bottom="1134" w:left="1304" w:header="720" w:footer="907" w:gutter="0"/>
       <w:cols w:num="1" w:space="425"/>
       <w:docGrid w:linePitch="360"/>
     </w:sectPr>
@@ -143,7 +143,7 @@
     <w:qFormat/>
     <w:pPr>
       <w:spacing w:before="0" w:after="0" w:line="320" w:lineRule="exact"/>
-      <w:ind w:firstLine="200"/>
+      <w:ind w:firstLine="438"/>
       <w:jc w:val="both"/>
     </w:pPr>
     <w:rPr>
@@ -192,7 +192,7 @@
     <w:qFormat/>
     <w:pPr>
       <w:spacing w:before="0" w:after="0" w:line="320" w:lineRule="exact"/>
-      <w:ind w:firstLine="200"/>
+      <w:ind w:firstLine="438"/>
       <w:jc w:val="both"/>
     </w:pPr>
     <w:rPr>
@@ -208,15 +208,15 @@
     <w:qFormat/>
     <w:pPr>
       <w:keepNext/>
-      <w:spacing w:before="0" w:after="0" w:line="360" w:lineRule="exact"/>
-      <w:jc w:val="center"/>
-    </w:pPr>
-    <w:rPr>
-      <w:rFonts w:ascii="Times New Roman" w:hAnsi="Times New Roman" w:eastAsia="黑体" w:cs="Times New Roman"/>
-      <w:b/>
-      <w:bCs/>
-      <w:sz w:val="30"/>
-      <w:szCs w:val="30"/>
+      <w:spacing w:before="0" w:after="0"/>
+      <w:jc w:val="center"/>
+    </w:pPr>
+    <w:rPr>
+      <w:rFonts w:ascii="Times New Roman" w:hAnsi="Times New Roman" w:eastAsia="宋体" w:cs="Times New Roman"/>
+      <w:b/>
+      <w:bCs/>
+      <w:sz w:val="44"/>
+      <w:szCs w:val="44"/>
       <w:lang w:val="en-US" w:eastAsia="zh-CN" w:bidi="ar-SA"/>
     </w:rPr>
   </w:style>
@@ -226,11 +226,13 @@
     <w:qFormat/>
     <w:pPr>
       <w:keepNext/>
-      <w:spacing w:before="0" w:after="0" w:line="336" w:lineRule="exact"/>
-      <w:jc w:val="center"/>
-    </w:pPr>
-    <w:rPr>
-      <w:rFonts w:ascii="Times New Roman" w:hAnsi="Times New Roman" w:eastAsia="Times New Roman" w:cs="Times New Roman"/>
+      <w:spacing w:before="0" w:after="0"/>
+      <w:jc w:val="center"/>
+    </w:pPr>
+    <w:rPr>
+      <w:rFonts w:ascii="Times New Roman" w:hAnsi="Times New Roman" w:eastAsia="Times New Roman" w:cs="Times New Roman"/>
+      <w:b/>
+      <w:bCs/>
       <w:sz w:val="28"/>
       <w:szCs w:val="28"/>
       <w:lang w:val="en-US" w:eastAsia="zh-CN" w:bidi="ar-SA"/>
@@ -241,13 +243,13 @@
     <w:basedOn w:val="Normal"/>
     <w:qFormat/>
     <w:pPr>
-      <w:spacing w:before="0" w:after="0" w:line="300" w:lineRule="exact"/>
-      <w:jc w:val="center"/>
-    </w:pPr>
-    <w:rPr>
-      <w:rFonts w:ascii="Times New Roman" w:hAnsi="Times New Roman" w:eastAsia="宋体" w:cs="Times New Roman"/>
-      <w:sz w:val="21"/>
-      <w:szCs w:val="21"/>
+      <w:spacing w:before="0" w:after="0"/>
+      <w:jc w:val="center"/>
+    </w:pPr>
+    <w:rPr>
+      <w:rFonts w:ascii="Times New Roman" w:hAnsi="Times New Roman" w:eastAsia="楷体" w:cs="Times New Roman"/>
+      <w:sz w:val="28"/>
+      <w:szCs w:val="28"/>
       <w:lang w:val="en-US" w:eastAsia="zh-CN" w:bidi="ar-SA"/>
     </w:rPr>
   </w:style>
@@ -256,11 +258,13 @@
     <w:basedOn w:val="Normal"/>
     <w:qFormat/>
     <w:pPr>
-      <w:spacing w:before="0" w:after="0" w:line="300" w:lineRule="exact"/>
-      <w:jc w:val="center"/>
-    </w:pPr>
-    <w:rPr>
-      <w:rFonts w:ascii="Times New Roman" w:hAnsi="Times New Roman" w:eastAsia="Times New Roman" w:cs="Times New Roman"/>
+      <w:spacing w:before="0" w:after="0"/>
+      <w:jc w:val="center"/>
+    </w:pPr>
+    <w:rPr>
+      <w:rFonts w:ascii="Times New Roman" w:hAnsi="Times New Roman" w:eastAsia="Times New Roman" w:cs="Times New Roman"/>
+      <w:b/>
+      <w:bCs/>
       <w:sz w:val="21"/>
       <w:szCs w:val="21"/>
       <w:lang w:val="en-US" w:eastAsia="zh-CN" w:bidi="ar-SA"/>
@@ -676,7 +680,7 @@
     <w:qFormat/>
     <w:pPr>
       <w:spacing w:before="0" w:after="0" w:line="320" w:lineRule="exact"/>
-      <w:ind w:firstLine="200"/>
+      <w:ind w:firstLine="438"/>
       <w:jc w:val="both"/>
     </w:pPr>
     <w:rPr>
@@ -692,15 +696,15 @@
     <w:qFormat/>
     <w:pPr>
       <w:keepNext/>
-      <w:spacing w:before="0" w:after="0" w:line="360" w:lineRule="exact"/>
-      <w:jc w:val="center"/>
-    </w:pPr>
-    <w:rPr>
-      <w:rFonts w:ascii="Times New Roman" w:hAnsi="Times New Roman" w:eastAsia="黑体" w:cs="Times New Roman"/>
-      <w:b/>
-      <w:bCs/>
-      <w:sz w:val="30"/>
-      <w:szCs w:val="30"/>
+      <w:spacing w:before="0" w:after="0"/>
+      <w:jc w:val="center"/>
+    </w:pPr>
+    <w:rPr>
+      <w:rFonts w:ascii="Times New Roman" w:hAnsi="Times New Roman" w:eastAsia="宋体" w:cs="Times New Roman"/>
+      <w:b/>
+      <w:bCs/>
+      <w:sz w:val="44"/>
+      <w:szCs w:val="44"/>
       <w:lang w:val="en-US" w:eastAsia="zh-CN" w:bidi="ar-SA"/>
     </w:rPr>
   </w:style>
@@ -710,11 +714,13 @@
     <w:qFormat/>
     <w:pPr>
       <w:keepNext/>
-      <w:spacing w:before="0" w:after="0" w:line="336" w:lineRule="exact"/>
-      <w:jc w:val="center"/>
-    </w:pPr>
-    <w:rPr>
-      <w:rFonts w:ascii="Times New Roman" w:hAnsi="Times New Roman" w:eastAsia="Times New Roman" w:cs="Times New Roman"/>
+      <w:spacing w:before="0" w:after="0"/>
+      <w:jc w:val="center"/>
+    </w:pPr>
+    <w:rPr>
+      <w:rFonts w:ascii="Times New Roman" w:hAnsi="Times New Roman" w:eastAsia="Times New Roman" w:cs="Times New Roman"/>
+      <w:b/>
+      <w:bCs/>
       <w:sz w:val="28"/>
       <w:szCs w:val="28"/>
       <w:lang w:val="en-US" w:eastAsia="zh-CN" w:bidi="ar-SA"/>
@@ -725,11 +731,13 @@
     <w:basedOn w:val="HFUTAuthorsEN"/>
     <w:qFormat/>
     <w:pPr>
-      <w:spacing w:before="0" w:after="0" w:line="300" w:lineRule="exact"/>
-      <w:jc w:val="center"/>
-    </w:pPr>
-    <w:rPr>
-      <w:rFonts w:ascii="Times New Roman" w:hAnsi="Times New Roman" w:eastAsia="Times New Roman" w:cs="Times New Roman"/>
+      <w:spacing w:before="0" w:after="0"/>
+      <w:jc w:val="center"/>
+    </w:pPr>
+    <w:rPr>
+      <w:rFonts w:ascii="Times New Roman" w:hAnsi="Times New Roman" w:eastAsia="Times New Roman" w:cs="Times New Roman"/>
+      <w:b/>
+      <w:bCs/>
       <w:sz w:val="21"/>
       <w:szCs w:val="21"/>
       <w:lang w:val="en-US" w:eastAsia="zh-CN" w:bidi="ar-SA"/>
@@ -856,6 +864,58 @@
       <w:rFonts w:ascii="Times New Roman" w:hAnsi="Times New Roman" w:eastAsia="宋体" w:cs="Times New Roman"/>
       <w:sz w:val="15"/>
       <w:szCs w:val="15"/>
+      <w:lang w:val="en-US" w:eastAsia="zh-CN" w:bidi="ar-SA"/>
+    </w:rPr>
+  </w:style>
+  <w:style w:type="character" w:styleId="HFUTAbstractLabelCNChar">
+    <w:name w:val="HFUT Abstract Label CN Char"/>
+    <w:basedOn w:val="DefaultParagraphFont"/>
+    <w:qFormat/>
+    <w:rPr>
+      <w:rFonts w:ascii="Times New Roman" w:hAnsi="Times New Roman" w:eastAsia="黑体" w:cs="Times New Roman"/>
+      <w:b/>
+      <w:bCs/>
+      <w:sz w:val="18"/>
+      <w:szCs w:val="18"/>
+      <w:lang w:val="en-US" w:eastAsia="zh-CN" w:bidi="ar-SA"/>
+    </w:rPr>
+  </w:style>
+  <w:style w:type="character" w:styleId="HFUTKeywordsLabelCNChar">
+    <w:name w:val="HFUT Keywords Label CN Char"/>
+    <w:basedOn w:val="DefaultParagraphFont"/>
+    <w:qFormat/>
+    <w:rPr>
+      <w:rFonts w:ascii="Times New Roman" w:hAnsi="Times New Roman" w:eastAsia="黑体" w:cs="Times New Roman"/>
+      <w:b/>
+      <w:bCs/>
+      <w:sz w:val="18"/>
+      <w:szCs w:val="18"/>
+      <w:lang w:val="en-US" w:eastAsia="zh-CN" w:bidi="ar-SA"/>
+    </w:rPr>
+  </w:style>
+  <w:style w:type="character" w:styleId="HFUTAbstractLabelENChar">
+    <w:name w:val="HFUT Abstract Label EN Char"/>
+    <w:basedOn w:val="DefaultParagraphFont"/>
+    <w:qFormat/>
+    <w:rPr>
+      <w:rFonts w:ascii="Times New Roman" w:hAnsi="Times New Roman" w:eastAsia="Times New Roman" w:cs="Times New Roman"/>
+      <w:b/>
+      <w:bCs/>
+      <w:sz w:val="21"/>
+      <w:szCs w:val="21"/>
+      <w:lang w:val="en-US" w:eastAsia="zh-CN" w:bidi="ar-SA"/>
+    </w:rPr>
+  </w:style>
+  <w:style w:type="character" w:styleId="HFUTKeywordsLabelENChar">
+    <w:name w:val="HFUT Keywords Label EN Char"/>
+    <w:basedOn w:val="DefaultParagraphFont"/>
+    <w:qFormat/>
+    <w:rPr>
+      <w:rFonts w:ascii="Times New Roman" w:hAnsi="Times New Roman" w:eastAsia="Times New Roman" w:cs="Times New Roman"/>
+      <w:b/>
+      <w:bCs/>
+      <w:sz w:val="21"/>
+      <w:szCs w:val="21"/>
       <w:lang w:val="en-US" w:eastAsia="zh-CN" w:bidi="ar-SA"/>
     </w:rPr>
   </w:style>

</xml_diff>

<commit_message>
paper: reconcile run-level HFUT format and Word pagination
</commit_message>
<xml_diff>
--- a/docs/paper/manuscript/template/hfut_journal_reference_v1.0.docx
+++ b/docs/paper/manuscript/template/hfut_journal_reference_v1.0.docx
@@ -312,8 +312,6 @@
     </w:pPr>
     <w:rPr>
       <w:rFonts w:ascii="Times New Roman" w:hAnsi="Times New Roman" w:eastAsia="黑体" w:cs="Times New Roman"/>
-      <w:b/>
-      <w:bCs/>
       <w:sz w:val="18"/>
       <w:szCs w:val="18"/>
       <w:lang w:val="en-US" w:eastAsia="zh-CN" w:bidi="ar-SA"/>
@@ -378,8 +376,6 @@
     </w:pPr>
     <w:rPr>
       <w:rFonts w:ascii="Times New Roman" w:hAnsi="Times New Roman" w:eastAsia="黑体" w:cs="Times New Roman"/>
-      <w:b/>
-      <w:bCs/>
       <w:sz w:val="18"/>
       <w:szCs w:val="18"/>
       <w:lang w:val="en-US" w:eastAsia="zh-CN" w:bidi="ar-SA"/>
@@ -462,8 +458,6 @@
     </w:pPr>
     <w:rPr>
       <w:rFonts w:ascii="Times New Roman" w:hAnsi="Times New Roman" w:eastAsia="黑体" w:cs="Times New Roman"/>
-      <w:b/>
-      <w:bCs/>
       <w:sz w:val="28"/>
       <w:szCs w:val="28"/>
       <w:lang w:val="en-US" w:eastAsia="zh-CN" w:bidi="ar-SA"/>
@@ -482,8 +476,6 @@
     </w:pPr>
     <w:rPr>
       <w:rFonts w:ascii="Times New Roman" w:hAnsi="Times New Roman" w:eastAsia="黑体" w:cs="Times New Roman"/>
-      <w:b/>
-      <w:bCs/>
       <w:sz w:val="21"/>
       <w:szCs w:val="21"/>
       <w:lang w:val="en-US" w:eastAsia="zh-CN" w:bidi="ar-SA"/>
@@ -514,10 +506,6 @@
     <w:pPr>
       <w:keepNext/>
       <w:keepLines/>
-      <w:numPr>
-        <w:ilvl w:val="0"/>
-        <w:numId w:val="2"/>
-      </w:numPr>
       <w:spacing w:before="0" w:after="0" w:line="320" w:lineRule="exact"/>
       <w:jc w:val="left"/>
       <w:outlineLvl w:val="0"/>
@@ -777,8 +765,6 @@
     </w:pPr>
     <w:rPr>
       <w:rFonts w:ascii="Times New Roman" w:hAnsi="Times New Roman" w:eastAsia="黑体" w:cs="Times New Roman"/>
-      <w:b/>
-      <w:bCs/>
       <w:sz w:val="28"/>
       <w:szCs w:val="28"/>
       <w:lang w:val="en-US" w:eastAsia="zh-CN" w:bidi="ar-SA"/>
@@ -797,8 +783,6 @@
     </w:pPr>
     <w:rPr>
       <w:rFonts w:ascii="Times New Roman" w:hAnsi="Times New Roman" w:eastAsia="黑体" w:cs="Times New Roman"/>
-      <w:b/>
-      <w:bCs/>
       <w:sz w:val="21"/>
       <w:szCs w:val="21"/>
       <w:lang w:val="en-US" w:eastAsia="zh-CN" w:bidi="ar-SA"/>
@@ -879,8 +863,6 @@
     <w:qFormat/>
     <w:rPr>
       <w:rFonts w:ascii="Times New Roman" w:hAnsi="Times New Roman" w:eastAsia="黑体" w:cs="Times New Roman"/>
-      <w:b/>
-      <w:bCs/>
       <w:sz w:val="18"/>
       <w:szCs w:val="18"/>
       <w:lang w:val="en-US" w:eastAsia="zh-CN" w:bidi="ar-SA"/>
@@ -892,8 +874,6 @@
     <w:qFormat/>
     <w:rPr>
       <w:rFonts w:ascii="Times New Roman" w:hAnsi="Times New Roman" w:eastAsia="黑体" w:cs="Times New Roman"/>
-      <w:b/>
-      <w:bCs/>
       <w:sz w:val="18"/>
       <w:szCs w:val="18"/>
       <w:lang w:val="en-US" w:eastAsia="zh-CN" w:bidi="ar-SA"/>
@@ -920,6 +900,122 @@
       <w:rFonts w:ascii="Times New Roman" w:hAnsi="Times New Roman" w:eastAsia="Times New Roman" w:cs="Times New Roman"/>
       <w:b/>
       <w:bCs/>
+      <w:sz w:val="21"/>
+      <w:szCs w:val="21"/>
+      <w:lang w:val="en-US" w:eastAsia="zh-CN" w:bidi="ar-SA"/>
+    </w:rPr>
+  </w:style>
+  <w:style w:type="character" w:styleId="HFUTClassificationLabelCNChar">
+    <w:name w:val="HFUT Classification Label CN Char"/>
+    <w:basedOn w:val="DefaultParagraphFont"/>
+    <w:qFormat/>
+    <w:rPr>
+      <w:rFonts w:ascii="Times New Roman" w:hAnsi="Times New Roman" w:eastAsia="黑体" w:cs="Times New Roman"/>
+      <w:sz w:val="18"/>
+      <w:szCs w:val="18"/>
+      <w:lang w:val="en-US" w:eastAsia="zh-CN" w:bidi="ar-SA"/>
+    </w:rPr>
+  </w:style>
+  <w:style w:type="character" w:styleId="HFUTClassificationValueChar">
+    <w:name w:val="HFUT Classification Value Char"/>
+    <w:basedOn w:val="DefaultParagraphFont"/>
+    <w:qFormat/>
+    <w:rPr>
+      <w:rFonts w:ascii="Times New Roman" w:hAnsi="Times New Roman" w:eastAsia="宋体" w:cs="Times New Roman"/>
+      <w:sz w:val="18"/>
+      <w:szCs w:val="18"/>
+      <w:lang w:val="en-US" w:eastAsia="zh-CN" w:bidi="ar-SA"/>
+    </w:rPr>
+  </w:style>
+  <w:style w:type="character" w:styleId="HFUTDocumentCodeLabelCNChar">
+    <w:name w:val="HFUT Document Code Label CN Char"/>
+    <w:basedOn w:val="DefaultParagraphFont"/>
+    <w:qFormat/>
+    <w:rPr>
+      <w:rFonts w:ascii="Times New Roman" w:hAnsi="Times New Roman" w:eastAsia="黑体" w:cs="Times New Roman"/>
+      <w:b/>
+      <w:bCs/>
+      <w:sz w:val="18"/>
+      <w:szCs w:val="18"/>
+      <w:lang w:val="en-US" w:eastAsia="zh-CN" w:bidi="ar-SA"/>
+    </w:rPr>
+  </w:style>
+  <w:style w:type="character" w:styleId="HFUTDocumentCodeValueChar">
+    <w:name w:val="HFUT Document Code Value Char"/>
+    <w:basedOn w:val="DefaultParagraphFont"/>
+    <w:qFormat/>
+    <w:rPr>
+      <w:rFonts w:ascii="Times New Roman" w:hAnsi="Times New Roman" w:eastAsia="宋体" w:cs="Times New Roman"/>
+      <w:sz w:val="18"/>
+      <w:szCs w:val="18"/>
+      <w:lang w:val="en-US" w:eastAsia="zh-CN" w:bidi="ar-SA"/>
+    </w:rPr>
+  </w:style>
+  <w:style w:type="character" w:styleId="HFUTHeadingNumber1Char">
+    <w:name w:val="HFUT Heading Number 1 Char"/>
+    <w:basedOn w:val="DefaultParagraphFont"/>
+    <w:qFormat/>
+    <w:rPr>
+      <w:rFonts w:ascii="Times New Roman" w:hAnsi="Times New Roman" w:eastAsia="黑体" w:cs="Times New Roman"/>
+      <w:b/>
+      <w:bCs/>
+      <w:sz w:val="28"/>
+      <w:szCs w:val="28"/>
+      <w:lang w:val="en-US" w:eastAsia="zh-CN" w:bidi="ar-SA"/>
+    </w:rPr>
+  </w:style>
+  <w:style w:type="character" w:styleId="HFUTHeadingTitle1Char">
+    <w:name w:val="HFUT Heading Title 1 Char"/>
+    <w:basedOn w:val="DefaultParagraphFont"/>
+    <w:qFormat/>
+    <w:rPr>
+      <w:rFonts w:ascii="Times New Roman" w:hAnsi="Times New Roman" w:eastAsia="黑体" w:cs="Times New Roman"/>
+      <w:sz w:val="28"/>
+      <w:szCs w:val="28"/>
+      <w:lang w:val="en-US" w:eastAsia="zh-CN" w:bidi="ar-SA"/>
+    </w:rPr>
+  </w:style>
+  <w:style w:type="character" w:styleId="HFUTHeadingNumber2Char">
+    <w:name w:val="HFUT Heading Number 2 Char"/>
+    <w:basedOn w:val="DefaultParagraphFont"/>
+    <w:qFormat/>
+    <w:rPr>
+      <w:rFonts w:ascii="Times New Roman" w:hAnsi="Times New Roman" w:eastAsia="黑体" w:cs="Times New Roman"/>
+      <w:b/>
+      <w:bCs/>
+      <w:sz w:val="21"/>
+      <w:szCs w:val="21"/>
+      <w:lang w:val="en-US" w:eastAsia="zh-CN" w:bidi="ar-SA"/>
+    </w:rPr>
+  </w:style>
+  <w:style w:type="character" w:styleId="HFUTHeadingTitle2Char">
+    <w:name w:val="HFUT Heading Title 2 Char"/>
+    <w:basedOn w:val="DefaultParagraphFont"/>
+    <w:qFormat/>
+    <w:rPr>
+      <w:rFonts w:ascii="Times New Roman" w:hAnsi="Times New Roman" w:eastAsia="黑体" w:cs="Times New Roman"/>
+      <w:sz w:val="21"/>
+      <w:szCs w:val="21"/>
+      <w:lang w:val="en-US" w:eastAsia="zh-CN" w:bidi="ar-SA"/>
+    </w:rPr>
+  </w:style>
+  <w:style w:type="character" w:styleId="HFUTHeadingNumber3Char">
+    <w:name w:val="HFUT Heading Number 3 Char"/>
+    <w:basedOn w:val="DefaultParagraphFont"/>
+    <w:qFormat/>
+    <w:rPr>
+      <w:rFonts w:ascii="Times New Roman" w:hAnsi="Times New Roman" w:eastAsia="楷体" w:cs="Times New Roman"/>
+      <w:sz w:val="21"/>
+      <w:szCs w:val="21"/>
+      <w:lang w:val="en-US" w:eastAsia="zh-CN" w:bidi="ar-SA"/>
+    </w:rPr>
+  </w:style>
+  <w:style w:type="character" w:styleId="HFUTHeadingTitle3Char">
+    <w:name w:val="HFUT Heading Title 3 Char"/>
+    <w:basedOn w:val="DefaultParagraphFont"/>
+    <w:qFormat/>
+    <w:rPr>
+      <w:rFonts w:ascii="Times New Roman" w:hAnsi="Times New Roman" w:eastAsia="楷体" w:cs="Times New Roman"/>
       <w:sz w:val="21"/>
       <w:szCs w:val="21"/>
       <w:lang w:val="en-US" w:eastAsia="zh-CN" w:bidi="ar-SA"/>

</xml_diff>